<commit_message>
task 1. Number 17
</commit_message>
<xml_diff>
--- a/task1/Отчёт.docx
+++ b/task1/Отчёт.docx
@@ -130,30 +130,19 @@
           </w:tcPr>
           <w:p>
             <w:pPr>
-              <w:pStyle w:val="2"/>
-              <w:spacing w:line="259" w:lineRule="auto"/>
-              <w:jc w:val="center"/>
-              <w:outlineLvl w:val="1"/>
+              <w:pStyle w:val="11"/>
               <w:rPr>
-                <w:rFonts w:eastAsia="Calibri"/>
-                <w:szCs w:val="28"/>
                 <w:shd w:val="clear" w:color="auto" w:fill="FFFFFF"/>
               </w:rPr>
             </w:pPr>
             <w:r>
               <w:rPr>
-                <w:rFonts w:eastAsia="Calibri"/>
-                <w:color w:val="000000" w:themeColor="text1"/>
-                <w:szCs w:val="28"/>
                 <w:shd w:val="clear" w:color="auto" w:fill="FFFFFF"/>
               </w:rPr>
               <w:t xml:space="preserve">Федеральное государственное бюджетное </w:t>
             </w:r>
             <w:r>
               <w:rPr>
-                <w:rFonts w:eastAsia="Calibri"/>
-                <w:color w:val="000000" w:themeColor="text1"/>
-                <w:szCs w:val="28"/>
                 <w:shd w:val="clear" w:color="auto" w:fill="FFFFFF"/>
               </w:rPr>
               <w:br/>
@@ -163,9 +152,7 @@
           <w:p>
             <w:pPr>
               <w:pStyle w:val="11"/>
-              <w:spacing w:line="259" w:lineRule="auto"/>
               <w:rPr>
-                <w:sz w:val="28"/>
                 <w:shd w:val="clear" w:color="auto" w:fill="FFFFFF"/>
                 <w:lang w:val="en-US"/>
               </w:rPr>
@@ -173,6 +160,7 @@
             <w:r>
               <w:rPr>
                 <w:noProof/>
+                <w:sz w:val="32"/>
                 <w:lang w:eastAsia="ru-RU"/>
               </w:rPr>
               <w:drawing>
@@ -238,6 +226,7 @@
             <w:r>
               <w:rPr>
                 <w:noProof/>
+                <w:sz w:val="32"/>
                 <w:lang w:eastAsia="ru-RU"/>
               </w:rPr>
               <w:drawing>
@@ -298,7 +287,7 @@
             </w:r>
             <w:r>
               <w:rPr>
-                <w:rFonts w:ascii="Calibri Light" w:hAnsi="Calibri Light" w:cs="Calibri Light"/>
+                <w:sz w:val="32"/>
               </w:rPr>
               <w:t>«Новосибирский государственный технический университет»</w:t>
             </w:r>
@@ -346,24 +335,16 @@
           </w:tcPr>
           <w:p>
             <w:pPr>
-              <w:pStyle w:val="3"/>
-              <w:jc w:val="center"/>
-              <w:outlineLvl w:val="2"/>
+              <w:pStyle w:val="11"/>
               <w:rPr>
                 <w:color w:val="000000" w:themeColor="text1"/>
               </w:rPr>
             </w:pPr>
             <w:r>
-              <w:rPr>
-                <w:rFonts w:eastAsia="Calibri"/>
-              </w:rPr>
               <w:t xml:space="preserve">Кафедра </w:t>
             </w:r>
             <w:sdt>
               <w:sdtPr>
-                <w:rPr>
-                  <w:rFonts w:eastAsia="Calibri"/>
-                </w:rPr>
                 <w:alias w:val="Кафедра"/>
                 <w:tag w:val="Кафедра"/>
                 <w:id w:val="-1641792045"/>
@@ -379,9 +360,6 @@
               <w:sdtEndPr/>
               <w:sdtContent>
                 <w:r>
-                  <w:rPr>
-                    <w:rFonts w:eastAsia="Calibri"/>
-                  </w:rPr>
                   <w:t>теоретической и прикладной информатики</w:t>
                 </w:r>
               </w:sdtContent>
@@ -406,15 +384,10 @@
           </w:tcPr>
           <w:p>
             <w:pPr>
-              <w:pStyle w:val="3"/>
-              <w:jc w:val="center"/>
-              <w:outlineLvl w:val="2"/>
+              <w:pStyle w:val="11"/>
             </w:pPr>
             <w:sdt>
               <w:sdtPr>
-                <w:rPr>
-                  <w:color w:val="000000" w:themeColor="text1"/>
-                </w:rPr>
                 <w:alias w:val="Вид работы"/>
                 <w:tag w:val="Вид работы"/>
                 <w:id w:val="2038628977"/>
@@ -430,24 +403,15 @@
               <w:sdtEndPr/>
               <w:sdtContent>
                 <w:r>
-                  <w:rPr>
-                    <w:color w:val="000000" w:themeColor="text1"/>
-                  </w:rPr>
                   <w:t>Лабораторная работа</w:t>
                 </w:r>
               </w:sdtContent>
             </w:sdt>
             <w:r>
-              <w:rPr>
-                <w:color w:val="000000" w:themeColor="text1"/>
-              </w:rPr>
               <w:t xml:space="preserve"> № </w:t>
             </w:r>
             <w:sdt>
               <w:sdtPr>
-                <w:rPr>
-                  <w:color w:val="000000" w:themeColor="text1"/>
-                </w:rPr>
                 <w:alias w:val="номер"/>
                 <w:tag w:val="номер"/>
                 <w:id w:val="1579561519"/>
@@ -468,9 +432,6 @@
               <w:sdtEndPr/>
               <w:sdtContent>
                 <w:r>
-                  <w:rPr>
-                    <w:color w:val="000000" w:themeColor="text1"/>
-                  </w:rPr>
                   <w:t>1</w:t>
                 </w:r>
               </w:sdtContent>
@@ -495,9 +456,7 @@
           </w:tcPr>
           <w:p>
             <w:pPr>
-              <w:pStyle w:val="3"/>
-              <w:jc w:val="center"/>
-              <w:outlineLvl w:val="2"/>
+              <w:pStyle w:val="11"/>
             </w:pPr>
             <w:r>
               <w:rPr>
@@ -636,24 +595,32 @@
                     <w:rFonts w:ascii="Calibri Light" w:hAnsi="Calibri Light" w:cs="Arial"/>
                     <w:b/>
                     <w:smallCaps/>
-                    <w:sz w:val="48"/>
+                    <w:sz w:val="40"/>
                     <w:szCs w:val="40"/>
                   </w:rPr>
-                  <w:t xml:space="preserve">командный интерфейс </w:t>
+                  <w:t>К</w:t>
                 </w:r>
-                <w:proofErr w:type="spellStart"/>
                 <w:r>
                   <w:rPr>
                     <w:rFonts w:ascii="Calibri Light" w:hAnsi="Calibri Light" w:cs="Arial"/>
                     <w:b/>
                     <w:smallCaps/>
-                    <w:sz w:val="48"/>
+                    <w:sz w:val="40"/>
+                    <w:szCs w:val="40"/>
+                  </w:rPr>
+                  <w:t xml:space="preserve">омандный интерфейс </w:t>
+                </w:r>
+                <w:r>
+                  <w:rPr>
+                    <w:rFonts w:ascii="Calibri Light" w:hAnsi="Calibri Light" w:cs="Arial"/>
+                    <w:b/>
+                    <w:smallCaps/>
+                    <w:sz w:val="40"/>
                     <w:szCs w:val="40"/>
                     <w:lang w:val="en-US"/>
                   </w:rPr>
-                  <w:t>linux</w:t>
+                  <w:t>Linux</w:t>
                 </w:r>
-                <w:proofErr w:type="spellEnd"/>
               </w:p>
             </w:sdtContent>
           </w:sdt>
@@ -744,7 +711,7 @@
                     <w:sz w:val="24"/>
                     <w:szCs w:val="24"/>
                   </w:rPr>
-                  <w:t>Бригада 11</w:t>
+                  <w:t>Бригада</w:t>
                 </w:r>
               </w:p>
             </w:sdtContent>
@@ -843,31 +810,7 @@
                     <w:sz w:val="24"/>
                     <w:szCs w:val="24"/>
                   </w:rPr>
-                  <w:t>Группа ПМ</w:t>
-                </w:r>
-                <w:r>
-                  <w:rPr>
-                    <w:rFonts w:cstheme="minorHAnsi"/>
-                    <w:sz w:val="24"/>
-                    <w:szCs w:val="24"/>
-                  </w:rPr>
-                  <w:t>И</w:t>
-                </w:r>
-                <w:r>
-                  <w:rPr>
-                    <w:rFonts w:cstheme="minorHAnsi"/>
-                    <w:sz w:val="24"/>
-                    <w:szCs w:val="24"/>
-                  </w:rPr>
-                  <w:t>-</w:t>
-                </w:r>
-                <w:r>
-                  <w:rPr>
-                    <w:rFonts w:cstheme="minorHAnsi"/>
-                    <w:sz w:val="24"/>
-                    <w:szCs w:val="24"/>
-                  </w:rPr>
-                  <w:t>32</w:t>
+                  <w:t>№11</w:t>
                 </w:r>
               </w:p>
             </w:sdtContent>
@@ -898,7 +841,16 @@
                 <w:sz w:val="24"/>
                 <w:szCs w:val="24"/>
               </w:rPr>
-              <w:t>Весёлый Денис</w:t>
+              <w:t>ВесЕ</w:t>
+            </w:r>
+            <w:r>
+              <w:rPr>
+                <w:rFonts w:cstheme="minorHAnsi"/>
+                <w:caps/>
+                <w:sz w:val="24"/>
+                <w:szCs w:val="24"/>
+              </w:rPr>
+              <w:t>лый Денис</w:t>
             </w:r>
           </w:p>
         </w:tc>
@@ -1031,6 +983,14 @@
                 <w:szCs w:val="24"/>
               </w:rPr>
             </w:pPr>
+            <w:r>
+              <w:rPr>
+                <w:rFonts w:cstheme="minorHAnsi"/>
+                <w:sz w:val="24"/>
+                <w:szCs w:val="24"/>
+              </w:rPr>
+              <w:t>Группа</w:t>
+            </w:r>
           </w:p>
         </w:tc>
         <w:tc>
@@ -1051,6 +1011,15 @@
                 <w:szCs w:val="24"/>
               </w:rPr>
             </w:pPr>
+            <w:r>
+              <w:rPr>
+                <w:rFonts w:cstheme="minorHAnsi"/>
+                <w:caps/>
+                <w:sz w:val="24"/>
+                <w:szCs w:val="24"/>
+              </w:rPr>
+              <w:t>ПМИ-32</w:t>
+            </w:r>
           </w:p>
         </w:tc>
       </w:tr>
@@ -1596,7 +1565,7 @@
             <v:path o:extrusionok="f" gradientshapeok="t" o:connecttype="rect"/>
             <o:lock v:ext="edit" aspectratio="t"/>
           </v:shapetype>
-          <v:shape id="_x0000_i1025" type="#_x0000_t75" style="width:467.7pt;height:40.05pt">
+          <v:shape id="_x0000_i1109" type="#_x0000_t75" style="width:467.7pt;height:40.05pt">
             <v:imagedata r:id="rId9" o:title="t1"/>
           </v:shape>
         </w:pict>
@@ -1650,7 +1619,7 @@
     <w:p>
       <w:r>
         <w:pict>
-          <v:shape id="_x0000_i1026" type="#_x0000_t75" style="width:467.7pt;height:31.95pt">
+          <v:shape id="_x0000_i1110" type="#_x0000_t75" style="width:467.7pt;height:31.95pt">
             <v:imagedata r:id="rId10" o:title="t2"/>
           </v:shape>
         </w:pict>
@@ -1792,7 +1761,7 @@
     <w:p>
       <w:r>
         <w:pict>
-          <v:shape id="_x0000_i1027" type="#_x0000_t75" style="width:467.7pt;height:136.5pt">
+          <v:shape id="_x0000_i1111" type="#_x0000_t75" style="width:467.7pt;height:136.5pt">
             <v:imagedata r:id="rId12" o:title="t3_2"/>
           </v:shape>
         </w:pict>
@@ -1854,7 +1823,7 @@
       <w:r>
         <w:lastRenderedPageBreak/>
         <w:pict>
-          <v:shape id="_x0000_i1028" type="#_x0000_t75" style="width:467.7pt;height:31.95pt">
+          <v:shape id="_x0000_i1112" type="#_x0000_t75" style="width:467.7pt;height:31.95pt">
             <v:imagedata r:id="rId13" o:title="t4"/>
           </v:shape>
         </w:pict>
@@ -1935,7 +1904,7 @@
     <w:p>
       <w:r>
         <w:pict>
-          <v:shape id="_x0000_i1029" type="#_x0000_t75" style="width:467.7pt;height:184.05pt">
+          <v:shape id="_x0000_i1113" type="#_x0000_t75" style="width:467.7pt;height:184.05pt">
             <v:imagedata r:id="rId14" o:title="t5"/>
           </v:shape>
         </w:pict>
@@ -1979,7 +1948,7 @@
     <w:p>
       <w:r>
         <w:pict>
-          <v:shape id="_x0000_i1030" type="#_x0000_t75" style="width:467.7pt;height:31.95pt">
+          <v:shape id="_x0000_i1114" type="#_x0000_t75" style="width:467.7pt;height:31.95pt">
             <v:imagedata r:id="rId15" o:title="t6"/>
           </v:shape>
         </w:pict>
@@ -2060,7 +2029,7 @@
     <w:p>
       <w:r>
         <w:pict>
-          <v:shape id="_x0000_i1031" type="#_x0000_t75" style="width:467.7pt;height:31.95pt">
+          <v:shape id="_x0000_i1115" type="#_x0000_t75" style="width:467.7pt;height:31.95pt">
             <v:imagedata r:id="rId16" o:title="t7"/>
           </v:shape>
         </w:pict>
@@ -2096,7 +2065,7 @@
     <w:p>
       <w:r>
         <w:pict>
-          <v:shape id="_x0000_i1034" type="#_x0000_t75" style="width:467.7pt;height:60.75pt">
+          <v:shape id="_x0000_i1116" type="#_x0000_t75" style="width:467.7pt;height:60.75pt">
             <v:imagedata r:id="rId17" o:title="t8"/>
           </v:shape>
         </w:pict>
@@ -2104,13 +2073,8 @@
     </w:p>
     <w:p>
       <w:pPr>
-        <w:shd w:val="clear" w:color="auto" w:fill="FFFFFF"/>
-        <w:spacing w:line="240" w:lineRule="auto"/>
-        <w:ind w:left="567"/>
-        <w:rPr>
-          <w:color w:val="1A1A1A"/>
-          <w:sz w:val="24"/>
-          <w:szCs w:val="24"/>
+        <w:pStyle w:val="a6"/>
+        <w:rPr>
           <w:shd w:val="clear" w:color="auto" w:fill="FFFFFF"/>
           <w:lang w:val="en-US"/>
         </w:rPr>
@@ -2118,18 +2082,12 @@
       <w:bookmarkStart w:id="1" w:name="_Hlk129533935"/>
       <w:r>
         <w:rPr>
-          <w:color w:val="1A1A1A"/>
-          <w:sz w:val="24"/>
-          <w:szCs w:val="24"/>
           <w:shd w:val="clear" w:color="auto" w:fill="FFFFFF"/>
         </w:rPr>
         <w:t>Имя владельца</w:t>
       </w:r>
       <w:r>
         <w:rPr>
-          <w:color w:val="1A1A1A"/>
-          <w:sz w:val="24"/>
-          <w:szCs w:val="24"/>
           <w:shd w:val="clear" w:color="auto" w:fill="FFFFFF"/>
           <w:lang w:val="en-US"/>
         </w:rPr>
@@ -2137,9 +2095,6 @@
       </w:r>
       <w:r>
         <w:rPr>
-          <w:color w:val="1A1A1A"/>
-          <w:sz w:val="24"/>
-          <w:szCs w:val="24"/>
           <w:shd w:val="clear" w:color="auto" w:fill="FFFFFF"/>
         </w:rPr>
         <w:t xml:space="preserve"> </w:t>
@@ -2148,9 +2103,6 @@
       <w:r>
         <w:rPr>
           <w:b/>
-          <w:color w:val="1A1A1A"/>
-          <w:sz w:val="24"/>
-          <w:szCs w:val="24"/>
           <w:shd w:val="clear" w:color="auto" w:fill="FFFFFF"/>
           <w:lang w:val="en-US"/>
         </w:rPr>
@@ -2160,9 +2112,6 @@
       <w:r>
         <w:rPr>
           <w:b/>
-          <w:color w:val="1A1A1A"/>
-          <w:sz w:val="24"/>
-          <w:szCs w:val="24"/>
           <w:shd w:val="clear" w:color="auto" w:fill="FFFFFF"/>
         </w:rPr>
         <w:t>-</w:t>
@@ -2170,41 +2119,21 @@
       <w:r>
         <w:rPr>
           <w:b/>
-          <w:color w:val="1A1A1A"/>
-          <w:sz w:val="24"/>
-          <w:szCs w:val="24"/>
           <w:shd w:val="clear" w:color="auto" w:fill="FFFFFF"/>
           <w:lang w:val="en-US"/>
         </w:rPr>
-        <w:t>b</w:t>
+        <w:t>b371</w:t>
       </w:r>
       <w:r>
         <w:rPr>
           <w:b/>
-          <w:color w:val="1A1A1A"/>
-          <w:sz w:val="24"/>
-          <w:szCs w:val="24"/>
           <w:shd w:val="clear" w:color="auto" w:fill="FFFFFF"/>
           <w:lang w:val="en-US"/>
         </w:rPr>
-        <w:t>371</w:t>
-      </w:r>
-      <w:r>
-        <w:rPr>
-          <w:b/>
-          <w:color w:val="1A1A1A"/>
-          <w:sz w:val="24"/>
-          <w:szCs w:val="24"/>
-          <w:shd w:val="clear" w:color="auto" w:fill="FFFFFF"/>
-          <w:lang w:val="en-US"/>
-        </w:rPr>
         <w:t>1</w:t>
       </w:r>
       <w:r>
         <w:rPr>
-          <w:color w:val="1A1A1A"/>
-          <w:sz w:val="24"/>
-          <w:szCs w:val="24"/>
           <w:shd w:val="clear" w:color="auto" w:fill="FFFFFF"/>
           <w:lang w:val="en-US"/>
         </w:rPr>
@@ -2299,7 +2228,7 @@
       <w:r>
         <w:lastRenderedPageBreak/>
         <w:pict>
-          <v:shape id="_x0000_i1042" type="#_x0000_t75" style="width:467.7pt;height:31.95pt">
+          <v:shape id="_x0000_i1125" type="#_x0000_t75" style="width:467.05pt;height:25.05pt">
             <v:imagedata r:id="rId18" o:title="t9_1"/>
           </v:shape>
         </w:pict>
@@ -2314,62 +2243,16 @@
       </w:r>
     </w:p>
     <w:p>
-      <w:pPr>
-        <w:pStyle w:val="a4"/>
-      </w:pPr>
       <w:r>
         <w:rPr>
           <w:noProof/>
           <w:lang w:eastAsia="ru-RU"/>
         </w:rPr>
-        <w:drawing>
-          <wp:inline distT="0" distB="0" distL="0" distR="0">
-            <wp:extent cx="5939790" cy="890270"/>
-            <wp:effectExtent l="0" t="0" r="3810" b="5080"/>
-            <wp:docPr id="8" name="Рисунок 8" descr="C:\Users\Admin\AppData\Local\Microsoft\Windows\INetCache\Content.Word\t9_2.png"/>
-            <wp:cNvGraphicFramePr>
-              <a:graphicFrameLocks xmlns:a="http://schemas.openxmlformats.org/drawingml/2006/main" noChangeAspect="1"/>
-            </wp:cNvGraphicFramePr>
-            <a:graphic xmlns:a="http://schemas.openxmlformats.org/drawingml/2006/main">
-              <a:graphicData uri="http://schemas.openxmlformats.org/drawingml/2006/picture">
-                <pic:pic xmlns:pic="http://schemas.openxmlformats.org/drawingml/2006/picture">
-                  <pic:nvPicPr>
-                    <pic:cNvPr id="0" name="Picture 34" descr="C:\Users\Admin\AppData\Local\Microsoft\Windows\INetCache\Content.Word\t9_2.png"/>
-                    <pic:cNvPicPr>
-                      <a:picLocks noChangeAspect="1" noChangeArrowheads="1"/>
-                    </pic:cNvPicPr>
-                  </pic:nvPicPr>
-                  <pic:blipFill>
-                    <a:blip r:embed="rId19">
-                      <a:extLst>
-                        <a:ext uri="{28A0092B-C50C-407E-A947-70E740481C1C}">
-                          <a14:useLocalDpi xmlns:a14="http://schemas.microsoft.com/office/drawing/2010/main" val="0"/>
-                        </a:ext>
-                      </a:extLst>
-                    </a:blip>
-                    <a:srcRect/>
-                    <a:stretch>
-                      <a:fillRect/>
-                    </a:stretch>
-                  </pic:blipFill>
-                  <pic:spPr bwMode="auto">
-                    <a:xfrm>
-                      <a:off x="0" y="0"/>
-                      <a:ext cx="5939790" cy="890270"/>
-                    </a:xfrm>
-                    <a:prstGeom prst="rect">
-                      <a:avLst/>
-                    </a:prstGeom>
-                    <a:noFill/>
-                    <a:ln>
-                      <a:noFill/>
-                    </a:ln>
-                  </pic:spPr>
-                </pic:pic>
-              </a:graphicData>
-            </a:graphic>
-          </wp:inline>
-        </w:drawing>
+        <w:pict>
+          <v:shape id="_x0000_i1126" type="#_x0000_t75" style="width:467.05pt;height:78.9pt">
+            <v:imagedata r:id="rId19" o:title="t9_2"/>
+          </v:shape>
+        </w:pict>
       </w:r>
     </w:p>
     <w:p>
@@ -2400,7 +2283,7 @@
           <w:ilvl w:val="1"/>
           <w:numId w:val="7"/>
         </w:numPr>
-        <w:ind w:left="851" w:hanging="284"/>
+        <w:ind w:left="1134" w:hanging="567"/>
       </w:pPr>
       <w:r>
         <w:t xml:space="preserve">Копирование файла в домашнем каталоге.  Скопировать файл ~/abc1 в файл </w:t>
@@ -2425,7 +2308,7 @@
     <w:p>
       <w:r>
         <w:pict>
-          <v:shape id="_x0000_i1081" type="#_x0000_t75" style="width:467.7pt;height:49.45pt">
+          <v:shape id="_x0000_i1130" type="#_x0000_t75" style="width:467.05pt;height:78.9pt">
             <v:imagedata r:id="rId20" o:title="t10_1"/>
           </v:shape>
         </w:pict>
@@ -2438,7 +2321,7 @@
           <w:ilvl w:val="1"/>
           <w:numId w:val="7"/>
         </w:numPr>
-        <w:ind w:left="851" w:hanging="284"/>
+        <w:ind w:left="1134" w:hanging="567"/>
       </w:pPr>
       <w:r>
         <w:t xml:space="preserve">Копирование нескольких файлов в каталог. Скопировать файлы </w:t>
@@ -2471,7 +2354,7 @@
     <w:p>
       <w:r>
         <w:pict>
-          <v:shape id="_x0000_i1082" type="#_x0000_t75" style="width:467.7pt;height:40.7pt">
+          <v:shape id="_x0000_i1132" type="#_x0000_t75" style="width:467.05pt;height:194.7pt">
             <v:imagedata r:id="rId21" o:title="t10_2"/>
           </v:shape>
         </w:pict>
@@ -2484,7 +2367,7 @@
           <w:ilvl w:val="1"/>
           <w:numId w:val="7"/>
         </w:numPr>
-        <w:ind w:left="851" w:hanging="284"/>
+        <w:ind w:left="1134" w:hanging="567"/>
       </w:pPr>
       <w:r>
         <w:t>Копирование файлов в произвольном каталоге. Скопировать</w:t>
@@ -2523,7 +2406,7 @@
     <w:p>
       <w:r>
         <w:pict>
-          <v:shape id="_x0000_i1083" type="#_x0000_t75" style="width:467.7pt;height:68.85pt">
+          <v:shape id="_x0000_i1261" type="#_x0000_t75" style="width:467.05pt;height:30.05pt">
             <v:imagedata r:id="rId22" o:title="t10_3"/>
           </v:shape>
         </w:pict>
@@ -2536,16 +2419,10 @@
           <w:ilvl w:val="1"/>
           <w:numId w:val="7"/>
         </w:numPr>
-        <w:ind w:left="851" w:hanging="284"/>
-      </w:pPr>
-      <w:r>
-        <w:t xml:space="preserve">Копирование </w:t>
-      </w:r>
-      <w:r>
-        <w:t>каталогов в текущем каталоге</w:t>
-      </w:r>
-      <w:r>
-        <w:t xml:space="preserve">. Скопировать каталог </w:t>
+        <w:ind w:left="1134" w:hanging="567"/>
+      </w:pPr>
+      <w:r>
+        <w:t xml:space="preserve">Копирование каталогов в текущем каталоге. Скопировать каталог </w:t>
       </w:r>
       <w:proofErr w:type="spellStart"/>
       <w:r>
@@ -2564,8 +2441,9 @@
     </w:p>
     <w:p>
       <w:r>
+        <w:lastRenderedPageBreak/>
         <w:pict>
-          <v:shape id="_x0000_i1086" type="#_x0000_t75" style="width:467.7pt;height:40.7pt">
+          <v:shape id="_x0000_i1275" type="#_x0000_t75" style="width:467.05pt;height:30.05pt">
             <v:imagedata r:id="rId23" o:title="t10_4"/>
           </v:shape>
         </w:pict>
@@ -2578,7 +2456,7 @@
           <w:ilvl w:val="1"/>
           <w:numId w:val="7"/>
         </w:numPr>
-        <w:ind w:left="851" w:hanging="284"/>
+        <w:ind w:left="1134" w:hanging="567"/>
       </w:pPr>
       <w:r>
         <w:t>Копирование   каталогов   в   произвольном   каталоге. Скопировать каталог monthly.</w:t>
@@ -2601,7 +2479,7 @@
     <w:p>
       <w:r>
         <w:pict>
-          <v:shape id="_x0000_i1087" type="#_x0000_t75" style="width:467.7pt;height:50.7pt">
+          <v:shape id="_x0000_i1122" type="#_x0000_t75" style="width:467.7pt;height:50.7pt">
             <v:imagedata r:id="rId24" o:title="t10_5"/>
           </v:shape>
         </w:pict>
@@ -2612,9 +2490,8 @@
         <w:pStyle w:val="1"/>
       </w:pPr>
       <w:r>
-        <w:lastRenderedPageBreak/>
         <w:pict>
-          <v:shape id="_x0000_i1092" type="#_x0000_t75" style="width:467.7pt;height:30.7pt">
+          <v:shape id="_x0000_i1123" type="#_x0000_t75" style="width:467.7pt;height:30.7pt">
             <v:imagedata r:id="rId25" o:title="t10_5_1"/>
           </v:shape>
         </w:pict>
@@ -2625,7 +2502,6 @@
         <w:pStyle w:val="a6"/>
         <w:ind w:left="284"/>
       </w:pPr>
-      <w:bookmarkStart w:id="2" w:name="_GoBack"/>
       <w:r>
         <w:t xml:space="preserve">Группа </w:t>
       </w:r>
@@ -2661,16 +2537,18 @@
         <w:t xml:space="preserve"> </w:t>
       </w:r>
       <w:r>
-        <w:t xml:space="preserve">создали папку раньше, чем мы, а наша группа не имеет </w:t>
-      </w:r>
-      <w:r>
-        <w:t>права на запись</w:t>
-      </w:r>
-      <w:r>
-        <w:t>.</w:t>
-      </w:r>
-    </w:p>
-    <w:bookmarkEnd w:id="2"/>
+        <w:t>создали папку раньше, чем мы,</w:t>
+      </w:r>
+      <w:r>
+        <w:t xml:space="preserve"> при этом</w:t>
+      </w:r>
+      <w:r>
+        <w:t xml:space="preserve"> наша </w:t>
+      </w:r>
+      <w:r>
+        <w:t>группа не имеет права на запись, поэтому перезаписать файлы мы не можем.</w:t>
+      </w:r>
+    </w:p>
     <w:p>
       <w:pPr>
         <w:pStyle w:val="a6"/>
@@ -2678,37 +2556,405 @@
           <w:ilvl w:val="1"/>
           <w:numId w:val="7"/>
         </w:numPr>
-        <w:ind w:left="851" w:hanging="284"/>
-      </w:pPr>
-      <w:r>
-        <w:t xml:space="preserve">Переименование </w:t>
+        <w:ind w:left="1134" w:hanging="567"/>
+      </w:pPr>
+      <w:r>
+        <w:t>Переименование файлов</w:t>
+      </w:r>
+      <w:r>
+        <w:t xml:space="preserve"> в</w:t>
+      </w:r>
+      <w:r>
+        <w:t xml:space="preserve"> текущем </w:t>
+      </w:r>
+      <w:r>
+        <w:t xml:space="preserve">каталоге.  Изменить название файла </w:t>
+      </w:r>
+      <w:proofErr w:type="spellStart"/>
+      <w:r>
+        <w:t>april</w:t>
+      </w:r>
+      <w:proofErr w:type="spellEnd"/>
+      <w:r>
+        <w:t xml:space="preserve"> на </w:t>
+      </w:r>
+      <w:proofErr w:type="spellStart"/>
+      <w:r>
+        <w:t>july</w:t>
+      </w:r>
+      <w:proofErr w:type="spellEnd"/>
+      <w:r>
+        <w:t xml:space="preserve"> в вашем домашнем каталоге</w:t>
+      </w:r>
+      <w:r>
+        <w:t>.</w:t>
+      </w:r>
+    </w:p>
+    <w:p>
+      <w:r>
+        <w:pict>
+          <v:shape id="_x0000_i1289" type="#_x0000_t75" style="width:467.05pt;height:39.45pt">
+            <v:imagedata r:id="rId26" o:title="t10_6"/>
+          </v:shape>
+        </w:pict>
+      </w:r>
+    </w:p>
+    <w:p>
+      <w:pPr>
+        <w:pStyle w:val="a6"/>
+        <w:numPr>
+          <w:ilvl w:val="1"/>
+          <w:numId w:val="7"/>
+        </w:numPr>
+        <w:ind w:left="1134" w:hanging="567"/>
+      </w:pPr>
+      <w:r>
+        <w:t xml:space="preserve">Перемещение </w:t>
+      </w:r>
+      <w:r>
+        <w:t>файлов в</w:t>
+      </w:r>
+      <w:r>
+        <w:t xml:space="preserve"> </w:t>
+      </w:r>
+      <w:r>
+        <w:t>другой каталог</w:t>
+      </w:r>
+      <w:r>
+        <w:t xml:space="preserve">.  Переместить файл </w:t>
+      </w:r>
+      <w:proofErr w:type="spellStart"/>
+      <w:r>
+        <w:t>july</w:t>
+      </w:r>
+      <w:proofErr w:type="spellEnd"/>
+      <w:r>
+        <w:t xml:space="preserve"> в каталог monthly.</w:t>
+      </w:r>
+      <w:r>
+        <w:t>21</w:t>
+      </w:r>
+      <w:r>
+        <w:t>.</w:t>
+      </w:r>
+    </w:p>
+    <w:p>
+      <w:r>
+        <w:pict>
+          <v:shape id="_x0000_i1291" type="#_x0000_t75" style="width:467.05pt;height:30.05pt">
+            <v:imagedata r:id="rId27" o:title="t10_7"/>
+          </v:shape>
+        </w:pict>
+      </w:r>
+    </w:p>
+    <w:p>
+      <w:pPr>
+        <w:pStyle w:val="a6"/>
+        <w:numPr>
+          <w:ilvl w:val="1"/>
+          <w:numId w:val="7"/>
+        </w:numPr>
+        <w:ind w:left="1134" w:hanging="567"/>
+      </w:pPr>
+      <w:r>
+        <w:t>Переименование    каталогов   в    текущем   каталоге. Переименовать каталог monthly.</w:t>
+      </w:r>
+      <w:r>
+        <w:t>21</w:t>
+      </w:r>
+      <w:r>
+        <w:t xml:space="preserve"> в monthly.05</w:t>
+      </w:r>
+      <w:r>
+        <w:t>.</w:t>
+      </w:r>
+    </w:p>
+    <w:p>
+      <w:r>
+        <w:pict>
+          <v:shape id="_x0000_i1292" type="#_x0000_t75" style="width:467.05pt;height:30.05pt">
+            <v:imagedata r:id="rId28" o:title="t10_8"/>
+          </v:shape>
+        </w:pict>
+      </w:r>
+    </w:p>
+    <w:p>
+      <w:pPr>
+        <w:pStyle w:val="a6"/>
+        <w:numPr>
+          <w:ilvl w:val="1"/>
+          <w:numId w:val="7"/>
+        </w:numPr>
+        <w:ind w:left="1134" w:hanging="567"/>
+      </w:pPr>
+      <w:r>
+        <w:t xml:space="preserve">Перемещение каталога </w:t>
+      </w:r>
+      <w:r>
+        <w:t>в другой каталог</w:t>
+      </w:r>
+      <w:r>
+        <w:t xml:space="preserve">.  Переместить каталог monthly.05 в каталог </w:t>
+      </w:r>
+      <w:proofErr w:type="spellStart"/>
+      <w:r>
+        <w:t>reports</w:t>
+      </w:r>
+      <w:proofErr w:type="spellEnd"/>
+      <w:r>
+        <w:t>.</w:t>
+      </w:r>
+    </w:p>
+    <w:p>
+      <w:r>
+        <w:pict>
+          <v:shape id="_x0000_i1294" type="#_x0000_t75" style="width:467.05pt;height:58.25pt">
+            <v:imagedata r:id="rId29" o:title="t10_9"/>
+          </v:shape>
+        </w:pict>
+      </w:r>
+    </w:p>
+    <w:p>
+      <w:pPr>
+        <w:pStyle w:val="a6"/>
+        <w:numPr>
+          <w:ilvl w:val="1"/>
+          <w:numId w:val="7"/>
+        </w:numPr>
+        <w:ind w:left="1134" w:hanging="567"/>
+        <w:rPr>
+          <w:lang w:val="en-US"/>
+        </w:rPr>
+      </w:pPr>
+      <w:r>
+        <w:t xml:space="preserve">Переименование   </w:t>
+      </w:r>
+      <w:r>
+        <w:t>каталога, не</w:t>
+      </w:r>
+      <w:r>
+        <w:t xml:space="preserve">   </w:t>
+      </w:r>
+      <w:r>
+        <w:t>являющегося текущим</w:t>
+      </w:r>
+      <w:r>
+        <w:t>. Переименовать</w:t>
+      </w:r>
+      <w:r>
+        <w:rPr>
+          <w:lang w:val="en-US"/>
+        </w:rPr>
+        <w:t xml:space="preserve"> </w:t>
+      </w:r>
+      <w:r>
+        <w:t>каталог</w:t>
+      </w:r>
+      <w:r>
+        <w:rPr>
+          <w:lang w:val="en-US"/>
+        </w:rPr>
+        <w:t xml:space="preserve"> reports/monthly.05 </w:t>
+      </w:r>
+      <w:r>
+        <w:t>в</w:t>
+      </w:r>
+      <w:r>
+        <w:rPr>
+          <w:lang w:val="en-US"/>
+        </w:rPr>
+        <w:t xml:space="preserve"> reports/monthly</w:t>
+      </w:r>
+      <w:r>
+        <w:rPr>
+          <w:lang w:val="en-US"/>
+        </w:rPr>
+        <w:t>.</w:t>
+      </w:r>
+    </w:p>
+    <w:p>
+      <w:pPr>
+        <w:rPr>
+          <w:lang w:val="en-US"/>
+        </w:rPr>
+      </w:pPr>
+      <w:r>
+        <w:rPr>
+          <w:lang w:val="en-US"/>
+        </w:rPr>
+        <w:pict>
+          <v:shape id="_x0000_i1295" type="#_x0000_t75" style="width:467.05pt;height:30.05pt">
+            <v:imagedata r:id="rId30" o:title="t10_10"/>
+          </v:shape>
+        </w:pict>
+      </w:r>
+    </w:p>
+    <w:p>
+      <w:pPr>
+        <w:pStyle w:val="a6"/>
+        <w:numPr>
+          <w:ilvl w:val="1"/>
+          <w:numId w:val="7"/>
+        </w:numPr>
+        <w:ind w:left="1134" w:hanging="567"/>
+      </w:pPr>
+      <w:r>
+        <w:t>Установка и отмена прав доступа</w:t>
+      </w:r>
+      <w:r>
+        <w:t>.</w:t>
+      </w:r>
+    </w:p>
+    <w:p>
+      <w:pPr>
+        <w:pStyle w:val="a6"/>
+      </w:pPr>
+      <w:r>
+        <w:t xml:space="preserve">- установить владельцу </w:t>
       </w:r>
       <w:proofErr w:type="gramStart"/>
       <w:r>
-        <w:t>файлов</w:t>
-      </w:r>
-      <w:r>
-        <w:t xml:space="preserve">  в</w:t>
+        <w:t>файла .</w:t>
       </w:r>
       <w:proofErr w:type="gramEnd"/>
       <w:r>
-        <w:t xml:space="preserve">  текущем  каталоге.  Изменить название файла </w:t>
+        <w:t>/</w:t>
       </w:r>
       <w:proofErr w:type="spellStart"/>
       <w:r>
-        <w:t>april</w:t>
+        <w:t>may</w:t>
       </w:r>
       <w:proofErr w:type="spellEnd"/>
       <w:r>
-        <w:t xml:space="preserve"> на </w:t>
+        <w:t xml:space="preserve"> права на выполнение:</w:t>
+      </w:r>
+    </w:p>
+    <w:p>
+      <w:pPr>
+        <w:rPr>
+          <w:lang w:val="en-US"/>
+        </w:rPr>
+      </w:pPr>
+      <w:r>
+        <w:rPr>
+          <w:lang w:val="en-US"/>
+        </w:rPr>
+        <w:lastRenderedPageBreak/>
+        <w:pict>
+          <v:shape id="_x0000_i1296" type="#_x0000_t75" style="width:467.05pt;height:30.05pt">
+            <v:imagedata r:id="rId31" o:title="t10_11_1"/>
+          </v:shape>
+        </w:pict>
+      </w:r>
+    </w:p>
+    <w:p>
+      <w:pPr>
+        <w:pStyle w:val="a6"/>
+      </w:pPr>
+      <w:r>
+        <w:t xml:space="preserve">- лишить владельца </w:t>
+      </w:r>
+      <w:proofErr w:type="gramStart"/>
+      <w:r>
+        <w:t>файла  .</w:t>
+      </w:r>
+      <w:proofErr w:type="gramEnd"/>
+      <w:r>
+        <w:t>/</w:t>
       </w:r>
       <w:proofErr w:type="spellStart"/>
       <w:r>
-        <w:t>july</w:t>
+        <w:t>may</w:t>
       </w:r>
       <w:proofErr w:type="spellEnd"/>
       <w:r>
-        <w:t xml:space="preserve"> в вашем домашнем каталоге</w:t>
+        <w:t xml:space="preserve"> права на выполнение:</w:t>
+      </w:r>
+    </w:p>
+    <w:p>
+      <w:r>
+        <w:pict>
+          <v:shape id="_x0000_i1297" type="#_x0000_t75" style="width:467.05pt;height:30.05pt">
+            <v:imagedata r:id="rId32" o:title="t10_11_2"/>
+          </v:shape>
+        </w:pict>
+      </w:r>
+    </w:p>
+    <w:p>
+      <w:pPr>
+        <w:pStyle w:val="a6"/>
+      </w:pPr>
+      <w:r>
+        <w:t xml:space="preserve">- отменить права на чтение каталога </w:t>
+      </w:r>
+      <w:proofErr w:type="spellStart"/>
+      <w:r>
+        <w:t>monthly</w:t>
+      </w:r>
+      <w:proofErr w:type="spellEnd"/>
+      <w:r>
+        <w:t xml:space="preserve"> для членов группы и всех остальных пользователей:</w:t>
+      </w:r>
+    </w:p>
+    <w:p>
+      <w:pPr>
+        <w:rPr>
+          <w:lang w:val="en-US"/>
+        </w:rPr>
+      </w:pPr>
+      <w:r>
+        <w:rPr>
+          <w:lang w:val="en-US"/>
+        </w:rPr>
+        <w:pict>
+          <v:shape id="_x0000_i1298" type="#_x0000_t75" style="width:467.05pt;height:30.05pt">
+            <v:imagedata r:id="rId33" o:title="t10_11_3"/>
+          </v:shape>
+        </w:pict>
+      </w:r>
+    </w:p>
+    <w:p>
+      <w:pPr>
+        <w:pStyle w:val="a6"/>
+      </w:pPr>
+      <w:r>
+        <w:t xml:space="preserve">- установить права </w:t>
+      </w:r>
+      <w:r>
+        <w:t xml:space="preserve">на запись в </w:t>
+      </w:r>
+      <w:proofErr w:type="gramStart"/>
+      <w:r>
+        <w:t>файл</w:t>
+      </w:r>
+      <w:r>
+        <w:t xml:space="preserve">  .</w:t>
+      </w:r>
+      <w:proofErr w:type="gramEnd"/>
+      <w:r>
+        <w:t>/abc1 членам группы:</w:t>
+      </w:r>
+    </w:p>
+    <w:p>
+      <w:r>
+        <w:pict>
+          <v:shape id="_x0000_i1309" type="#_x0000_t75" style="width:467.05pt;height:30.05pt">
+            <v:imagedata r:id="rId34" o:title="t10_11_4"/>
+          </v:shape>
+        </w:pict>
+      </w:r>
+    </w:p>
+    <w:p>
+      <w:pPr>
+        <w:pStyle w:val="a6"/>
+        <w:numPr>
+          <w:ilvl w:val="1"/>
+          <w:numId w:val="7"/>
+        </w:numPr>
+        <w:ind w:left="1134" w:hanging="567"/>
+      </w:pPr>
+      <w:r>
+        <w:t>Поиск файлов и каталогов</w:t>
       </w:r>
       <w:r>
         <w:t>.</w:t>
@@ -2717,15 +2963,935 @@
     <w:p>
       <w:pPr>
         <w:pStyle w:val="a6"/>
-        <w:ind w:left="1440" w:firstLine="0"/>
-        <w:rPr>
-          <w:lang w:val="en-US"/>
-        </w:rPr>
-      </w:pPr>
+        <w:rPr>
+          <w:sz w:val="24"/>
+          <w:szCs w:val="24"/>
+        </w:rPr>
+      </w:pPr>
+      <w:r>
+        <w:t xml:space="preserve">- найти в </w:t>
+      </w:r>
+      <w:proofErr w:type="gramStart"/>
+      <w:r>
+        <w:t>домашнем  каталоге</w:t>
+      </w:r>
+      <w:proofErr w:type="gramEnd"/>
+      <w:r>
+        <w:t xml:space="preserve"> и подкаталогах файлы с именем </w:t>
+      </w:r>
+      <w:r>
+        <w:rPr>
+          <w:lang w:val="en-US"/>
+        </w:rPr>
+        <w:t>may</w:t>
+      </w:r>
+      <w:r>
+        <w:t xml:space="preserve">  и удалить их:</w:t>
+      </w:r>
+    </w:p>
+    <w:p>
+      <w:pPr>
+        <w:rPr>
+          <w:lang w:val="en-US"/>
+        </w:rPr>
+      </w:pPr>
+      <w:r>
+        <w:rPr>
+          <w:lang w:val="en-US"/>
+        </w:rPr>
+        <w:pict>
+          <v:shape id="_x0000_i1310" type="#_x0000_t75" style="width:467.05pt;height:222.25pt">
+            <v:imagedata r:id="rId35" o:title="t10_12_1"/>
+          </v:shape>
+        </w:pict>
+      </w:r>
     </w:p>
     <w:p>
       <w:pPr>
         <w:pStyle w:val="a6"/>
+        <w:rPr>
+          <w:szCs w:val="28"/>
+        </w:rPr>
+      </w:pPr>
+      <w:r>
+        <w:rPr>
+          <w:szCs w:val="28"/>
+        </w:rPr>
+        <w:t>- найти все файлы с именем, содержащим строку ‘</w:t>
+      </w:r>
+      <w:proofErr w:type="spellStart"/>
+      <w:r>
+        <w:rPr>
+          <w:szCs w:val="28"/>
+          <w:lang w:val="en-US"/>
+        </w:rPr>
+        <w:t>fstab</w:t>
+      </w:r>
+      <w:proofErr w:type="spellEnd"/>
+      <w:r>
+        <w:rPr>
+          <w:szCs w:val="28"/>
+        </w:rPr>
+        <w:t>’:</w:t>
+      </w:r>
+    </w:p>
+    <w:p>
+      <w:r>
+        <w:pict>
+          <v:shape id="_x0000_i1312" type="#_x0000_t75" style="width:467.05pt;height:124.6pt">
+            <v:imagedata r:id="rId36" o:title="t10_12_2"/>
+          </v:shape>
+        </w:pict>
+      </w:r>
+    </w:p>
+    <w:p>
+      <w:pPr>
+        <w:pStyle w:val="a6"/>
+        <w:rPr>
+          <w:szCs w:val="28"/>
+        </w:rPr>
+      </w:pPr>
+      <w:r>
+        <w:rPr>
+          <w:szCs w:val="28"/>
+        </w:rPr>
+        <w:t xml:space="preserve">- найти все файлы с именем </w:t>
+      </w:r>
+      <w:proofErr w:type="spellStart"/>
+      <w:r>
+        <w:rPr>
+          <w:szCs w:val="28"/>
+          <w:lang w:val="en-US"/>
+        </w:rPr>
+        <w:t>fstab</w:t>
+      </w:r>
+      <w:proofErr w:type="spellEnd"/>
+      <w:r>
+        <w:rPr>
+          <w:szCs w:val="28"/>
+        </w:rPr>
+        <w:t>:</w:t>
+      </w:r>
+    </w:p>
+    <w:p>
+      <w:pPr>
+        <w:rPr>
+          <w:lang w:val="en-US"/>
+        </w:rPr>
+      </w:pPr>
+      <w:r>
+        <w:rPr>
+          <w:lang w:val="en-US"/>
+        </w:rPr>
+        <w:lastRenderedPageBreak/>
+        <w:pict>
+          <v:shape id="_x0000_i1318" type="#_x0000_t75" style="width:467.05pt;height:20.65pt">
+            <v:imagedata r:id="rId37" o:title="t10_12_3"/>
+          </v:shape>
+        </w:pict>
+      </w:r>
+    </w:p>
+    <w:p>
+      <w:pPr>
+        <w:pStyle w:val="2"/>
+        <w:numPr>
+          <w:ilvl w:val="0"/>
+          <w:numId w:val="7"/>
+        </w:numPr>
+        <w:ind w:left="284" w:hanging="284"/>
+        <w:rPr>
+          <w:lang w:val="en-US"/>
+        </w:rPr>
+      </w:pPr>
+    </w:p>
+    <w:p>
+      <w:pPr>
+        <w:pStyle w:val="a6"/>
+        <w:rPr>
+          <w:sz w:val="22"/>
+        </w:rPr>
+      </w:pPr>
+      <w:r>
+        <w:t xml:space="preserve">Создайте три новых каталога </w:t>
+      </w:r>
+      <w:r>
+        <w:t>с именами</w:t>
+      </w:r>
+      <w:r>
+        <w:t xml:space="preserve"> </w:t>
+      </w:r>
+      <w:proofErr w:type="spellStart"/>
+      <w:r>
+        <w:rPr>
+          <w:b/>
+        </w:rPr>
+        <w:t>letters</w:t>
+      </w:r>
+      <w:proofErr w:type="spellEnd"/>
+      <w:r>
+        <w:rPr>
+          <w:b/>
+        </w:rPr>
+        <w:t xml:space="preserve">, </w:t>
+      </w:r>
+      <w:proofErr w:type="spellStart"/>
+      <w:r>
+        <w:rPr>
+          <w:b/>
+        </w:rPr>
+        <w:t>memos</w:t>
+      </w:r>
+      <w:proofErr w:type="spellEnd"/>
+      <w:r>
+        <w:rPr>
+          <w:b/>
+        </w:rPr>
+        <w:t xml:space="preserve">, </w:t>
+      </w:r>
+      <w:proofErr w:type="spellStart"/>
+      <w:r>
+        <w:rPr>
+          <w:b/>
+        </w:rPr>
+        <w:t>misk</w:t>
+      </w:r>
+      <w:proofErr w:type="spellEnd"/>
+      <w:r>
+        <w:t xml:space="preserve"> в вашем домашнем каталоге одной командой</w:t>
+      </w:r>
+      <w:r>
+        <w:t>.</w:t>
+      </w:r>
+    </w:p>
+    <w:p>
+      <w:r>
+        <w:pict>
+          <v:shape id="_x0000_i1319" type="#_x0000_t75" style="width:467.05pt;height:39.45pt">
+            <v:imagedata r:id="rId38" o:title="t11"/>
+          </v:shape>
+        </w:pict>
+      </w:r>
+    </w:p>
+    <w:p>
+      <w:pPr>
+        <w:pStyle w:val="2"/>
+        <w:numPr>
+          <w:ilvl w:val="0"/>
+          <w:numId w:val="7"/>
+        </w:numPr>
+        <w:ind w:left="284" w:hanging="284"/>
+        <w:rPr>
+          <w:lang w:val="en-US"/>
+        </w:rPr>
+      </w:pPr>
+    </w:p>
+    <w:p>
+      <w:pPr>
+        <w:pStyle w:val="a6"/>
+      </w:pPr>
+      <w:r>
+        <w:t>Удалите эти каталоги одной командой</w:t>
+      </w:r>
+      <w:r>
+        <w:t>.</w:t>
+      </w:r>
+    </w:p>
+    <w:p>
+      <w:r>
+        <w:pict>
+          <v:shape id="_x0000_i1320" type="#_x0000_t75" style="width:467.05pt;height:30.05pt">
+            <v:imagedata r:id="rId39" o:title="t12"/>
+          </v:shape>
+        </w:pict>
+      </w:r>
+    </w:p>
+    <w:p>
+      <w:pPr>
+        <w:pStyle w:val="2"/>
+        <w:numPr>
+          <w:ilvl w:val="0"/>
+          <w:numId w:val="7"/>
+        </w:numPr>
+        <w:ind w:left="284" w:hanging="284"/>
+        <w:rPr>
+          <w:lang w:val="en-US"/>
+        </w:rPr>
+      </w:pPr>
+    </w:p>
+    <w:p>
+      <w:pPr>
+        <w:pStyle w:val="a6"/>
+      </w:pPr>
+      <w:r>
+        <w:t>Попробуйте удалить каталог ~</w:t>
+      </w:r>
+      <w:r>
+        <w:rPr>
+          <w:b/>
+        </w:rPr>
+        <w:t>/</w:t>
+      </w:r>
+      <w:proofErr w:type="spellStart"/>
+      <w:r>
+        <w:rPr>
+          <w:b/>
+        </w:rPr>
+        <w:t>tmp</w:t>
+      </w:r>
+      <w:proofErr w:type="spellEnd"/>
+      <w:r>
+        <w:rPr>
+          <w:b/>
+          <w:szCs w:val="28"/>
+        </w:rPr>
+        <w:t>_</w:t>
+      </w:r>
+      <w:proofErr w:type="spellStart"/>
+      <w:r>
+        <w:rPr>
+          <w:b/>
+          <w:szCs w:val="28"/>
+          <w:lang w:val="en-US"/>
+        </w:rPr>
+        <w:t>kk</w:t>
+      </w:r>
+      <w:proofErr w:type="spellEnd"/>
+      <w:r>
+        <w:t xml:space="preserve"> командой </w:t>
+      </w:r>
+      <w:proofErr w:type="spellStart"/>
+      <w:r>
+        <w:t>rm</w:t>
+      </w:r>
+      <w:proofErr w:type="spellEnd"/>
+      <w:r>
+        <w:t>.</w:t>
+      </w:r>
+      <w:r>
+        <w:t xml:space="preserve"> Что получилось? Как можно удалить этот </w:t>
+      </w:r>
+      <w:r>
+        <w:t>каталог?</w:t>
+      </w:r>
+    </w:p>
+    <w:p>
+      <w:r>
+        <w:pict>
+          <v:shape id="_x0000_i1321" type="#_x0000_t75" style="width:467.7pt;height:31.95pt">
+            <v:imagedata r:id="rId40" o:title="t13_its_dir"/>
+          </v:shape>
+        </w:pict>
+      </w:r>
+    </w:p>
+    <w:p>
+      <w:pPr>
+        <w:pStyle w:val="a6"/>
+      </w:pPr>
+      <w:r>
+        <w:t xml:space="preserve">Удалить не вышло, так как </w:t>
+      </w:r>
+      <w:proofErr w:type="spellStart"/>
+      <w:r>
+        <w:rPr>
+          <w:b/>
+          <w:lang w:val="en-US"/>
+        </w:rPr>
+        <w:t>tmp</w:t>
+      </w:r>
+      <w:proofErr w:type="spellEnd"/>
+      <w:r>
+        <w:rPr>
+          <w:b/>
+        </w:rPr>
+        <w:t>_11</w:t>
+      </w:r>
+      <w:r>
+        <w:t xml:space="preserve"> </w:t>
+      </w:r>
+      <w:r>
+        <w:t>–</w:t>
+      </w:r>
+      <w:r>
+        <w:t xml:space="preserve"> </w:t>
+      </w:r>
+      <w:r>
+        <w:t xml:space="preserve">директория и нужно использовать специальные флаги, например </w:t>
+      </w:r>
+      <w:r>
+        <w:rPr>
+          <w:b/>
+        </w:rPr>
+        <w:t>-</w:t>
+      </w:r>
+      <w:r>
+        <w:rPr>
+          <w:b/>
+          <w:lang w:val="en-US"/>
+        </w:rPr>
+        <w:t>R</w:t>
+      </w:r>
+      <w:r>
+        <w:rPr>
+          <w:b/>
+        </w:rPr>
+        <w:t xml:space="preserve"> –</w:t>
+      </w:r>
+      <w:r>
+        <w:t xml:space="preserve"> </w:t>
+      </w:r>
+      <w:r>
+        <w:t>для рекурсивного удаления.</w:t>
+      </w:r>
+    </w:p>
+    <w:p>
+      <w:pPr>
+        <w:rPr>
+          <w:lang w:val="en-US"/>
+        </w:rPr>
+      </w:pPr>
+      <w:r>
+        <w:rPr>
+          <w:lang w:val="en-US"/>
+        </w:rPr>
+        <w:pict>
+          <v:shape id="_x0000_i1322" type="#_x0000_t75" style="width:467.7pt;height:40.7pt">
+            <v:imagedata r:id="rId41" o:title="t13_deleted_within_R"/>
+          </v:shape>
+        </w:pict>
+      </w:r>
+    </w:p>
+    <w:p>
+      <w:pPr>
+        <w:pStyle w:val="2"/>
+        <w:numPr>
+          <w:ilvl w:val="0"/>
+          <w:numId w:val="7"/>
+        </w:numPr>
+        <w:ind w:left="284" w:hanging="284"/>
+        <w:rPr>
+          <w:lang w:val="en-US"/>
+        </w:rPr>
+      </w:pPr>
+    </w:p>
+    <w:p>
+      <w:pPr>
+        <w:pStyle w:val="a6"/>
+      </w:pPr>
+      <w:r>
+        <w:t xml:space="preserve">С помощью команды </w:t>
+      </w:r>
+      <w:proofErr w:type="spellStart"/>
+      <w:r>
+        <w:rPr>
+          <w:b/>
+        </w:rPr>
+        <w:t>man</w:t>
+      </w:r>
+      <w:proofErr w:type="spellEnd"/>
+      <w:r>
+        <w:t xml:space="preserve"> определите, какая опция команды </w:t>
+      </w:r>
+      <w:proofErr w:type="spellStart"/>
+      <w:r>
+        <w:rPr>
+          <w:b/>
+        </w:rPr>
+        <w:t>ls</w:t>
+      </w:r>
+      <w:proofErr w:type="spellEnd"/>
+      <w:r>
+        <w:t xml:space="preserve"> позволяет просматривать не только </w:t>
+      </w:r>
+      <w:r>
+        <w:t>содержимое указанного</w:t>
+      </w:r>
+      <w:r>
+        <w:t xml:space="preserve"> каталога</w:t>
+      </w:r>
+      <w:r>
+        <w:t>,</w:t>
+      </w:r>
+      <w:r>
+        <w:t xml:space="preserve"> но и подкаталогов, входящих в него. Проверьте работу этой опции</w:t>
+      </w:r>
+      <w:r>
+        <w:t>.</w:t>
+      </w:r>
+    </w:p>
+    <w:p>
+      <w:pPr>
+        <w:rPr>
+          <w:lang w:val="en-US"/>
+        </w:rPr>
+      </w:pPr>
+      <w:r>
+        <w:rPr>
+          <w:lang w:val="en-US"/>
+        </w:rPr>
+        <w:pict>
+          <v:shape id="_x0000_i1323" type="#_x0000_t75" style="width:467.05pt;height:229.15pt">
+            <v:imagedata r:id="rId42" o:title="t14"/>
+          </v:shape>
+        </w:pict>
+      </w:r>
+    </w:p>
+    <w:p>
+      <w:pPr>
+        <w:pStyle w:val="2"/>
+        <w:numPr>
+          <w:ilvl w:val="0"/>
+          <w:numId w:val="7"/>
+        </w:numPr>
+        <w:ind w:left="284" w:hanging="284"/>
+        <w:rPr>
+          <w:lang w:val="en-US"/>
+        </w:rPr>
+      </w:pPr>
+    </w:p>
+    <w:p>
+      <w:pPr>
+        <w:pStyle w:val="a6"/>
+      </w:pPr>
+      <w:r>
+        <w:t>Определите при</w:t>
+      </w:r>
+      <w:r>
+        <w:t xml:space="preserve"> </w:t>
+      </w:r>
+      <w:r>
+        <w:t>помощи команды</w:t>
+      </w:r>
+      <w:r>
+        <w:t xml:space="preserve"> </w:t>
+      </w:r>
+      <w:proofErr w:type="spellStart"/>
+      <w:r>
+        <w:rPr>
+          <w:b/>
+        </w:rPr>
+        <w:t>man</w:t>
+      </w:r>
+      <w:proofErr w:type="spellEnd"/>
+      <w:r>
+        <w:t>, какой набор</w:t>
+      </w:r>
+      <w:r>
+        <w:t xml:space="preserve"> опций команды   </w:t>
+      </w:r>
+      <w:proofErr w:type="spellStart"/>
+      <w:r>
+        <w:rPr>
+          <w:b/>
+        </w:rPr>
+        <w:t>ls</w:t>
+      </w:r>
+      <w:proofErr w:type="spellEnd"/>
+      <w:r>
+        <w:t xml:space="preserve">   позволяет   отсортировать   </w:t>
+      </w:r>
+      <w:r>
+        <w:t>список с</w:t>
+      </w:r>
+      <w:r>
+        <w:t xml:space="preserve"> развернутым описанием </w:t>
+      </w:r>
+      <w:r>
+        <w:t>файлов по</w:t>
+      </w:r>
+      <w:r>
+        <w:t xml:space="preserve"> времени последнего изменения. Создайте псевдоним для этой команды с именем “</w:t>
+      </w:r>
+      <w:r>
+        <w:rPr>
+          <w:lang w:val="en-US"/>
+        </w:rPr>
+        <w:t>l</w:t>
+      </w:r>
+      <w:r>
+        <w:t>_</w:t>
+      </w:r>
+      <w:proofErr w:type="spellStart"/>
+      <w:r>
+        <w:rPr>
+          <w:lang w:val="en-US"/>
+        </w:rPr>
+        <w:t>kk</w:t>
+      </w:r>
+      <w:proofErr w:type="spellEnd"/>
+      <w:r>
+        <w:t>”, проверьте его работоспособность</w:t>
+      </w:r>
+      <w:r>
+        <w:t>.</w:t>
+      </w:r>
+    </w:p>
+    <w:p>
+      <w:pPr>
+        <w:rPr>
+          <w:lang w:val="en-US"/>
+        </w:rPr>
+      </w:pPr>
+      <w:r>
+        <w:rPr>
+          <w:lang w:val="en-US"/>
+        </w:rPr>
+        <w:pict>
+          <v:shape id="_x0000_i1331" type="#_x0000_t75" style="width:467.7pt;height:133.35pt">
+            <v:imagedata r:id="rId43" o:title="t15"/>
+          </v:shape>
+        </w:pict>
+      </w:r>
+    </w:p>
+    <w:p>
+      <w:pPr>
+        <w:pStyle w:val="2"/>
+        <w:numPr>
+          <w:ilvl w:val="0"/>
+          <w:numId w:val="7"/>
+        </w:numPr>
+        <w:ind w:left="284" w:hanging="284"/>
+        <w:rPr>
+          <w:lang w:val="en-US"/>
+        </w:rPr>
+      </w:pPr>
+    </w:p>
+    <w:p>
+      <w:pPr>
+        <w:pStyle w:val="a6"/>
+      </w:pPr>
+      <w:r>
+        <w:t xml:space="preserve">Определите типы команд </w:t>
+      </w:r>
+      <w:proofErr w:type="spellStart"/>
+      <w:r>
+        <w:rPr>
+          <w:b/>
+        </w:rPr>
+        <w:t>cd</w:t>
+      </w:r>
+      <w:proofErr w:type="spellEnd"/>
+      <w:r>
+        <w:t xml:space="preserve">, </w:t>
+      </w:r>
+      <w:proofErr w:type="spellStart"/>
+      <w:r>
+        <w:rPr>
+          <w:b/>
+        </w:rPr>
+        <w:t>pwd</w:t>
+      </w:r>
+      <w:proofErr w:type="spellEnd"/>
+      <w:r>
+        <w:t xml:space="preserve">, </w:t>
+      </w:r>
+      <w:r>
+        <w:rPr>
+          <w:b/>
+          <w:lang w:val="en-US"/>
+        </w:rPr>
+        <w:t>find</w:t>
+      </w:r>
+      <w:r>
+        <w:t xml:space="preserve">, </w:t>
+      </w:r>
+      <w:proofErr w:type="spellStart"/>
+      <w:r>
+        <w:rPr>
+          <w:b/>
+          <w:lang w:val="en-US"/>
+        </w:rPr>
+        <w:t>grep</w:t>
+      </w:r>
+      <w:proofErr w:type="spellEnd"/>
+      <w:r>
+        <w:t xml:space="preserve">, </w:t>
+      </w:r>
+      <w:r>
+        <w:rPr>
+          <w:b/>
+          <w:lang w:val="en-US"/>
+        </w:rPr>
+        <w:t>vim</w:t>
+      </w:r>
+      <w:r>
+        <w:t>.</w:t>
+      </w:r>
+    </w:p>
+    <w:p>
+      <w:r>
+        <w:pict>
+          <v:shape id="_x0000_i1332" type="#_x0000_t75" style="width:467.7pt;height:68.85pt">
+            <v:imagedata r:id="rId44" o:title="t16_note_grep_is_alias"/>
+          </v:shape>
+        </w:pict>
+      </w:r>
+    </w:p>
+    <w:p>
+      <w:pPr>
+        <w:pStyle w:val="a6"/>
+      </w:pPr>
+      <w:r>
+        <w:t xml:space="preserve">Команда </w:t>
+      </w:r>
+      <w:proofErr w:type="spellStart"/>
+      <w:r>
+        <w:rPr>
+          <w:b/>
+          <w:lang w:val="en-US"/>
+        </w:rPr>
+        <w:t>grep</w:t>
+      </w:r>
+      <w:proofErr w:type="spellEnd"/>
+      <w:r>
+        <w:t xml:space="preserve"> </w:t>
+      </w:r>
+      <w:r>
+        <w:t>является псевдонимом (</w:t>
+      </w:r>
+      <w:r>
+        <w:rPr>
+          <w:lang w:val="en-US"/>
+        </w:rPr>
+        <w:t>alias</w:t>
+      </w:r>
+      <w:r>
+        <w:t>).</w:t>
+      </w:r>
+    </w:p>
+    <w:p>
+      <w:pPr>
+        <w:pStyle w:val="2"/>
+        <w:numPr>
+          <w:ilvl w:val="0"/>
+          <w:numId w:val="7"/>
+        </w:numPr>
+        <w:ind w:left="284" w:hanging="284"/>
+        <w:rPr>
+          <w:lang w:val="en-US"/>
+        </w:rPr>
+      </w:pPr>
+    </w:p>
+    <w:p>
+      <w:pPr>
+        <w:pStyle w:val="a6"/>
+      </w:pPr>
+      <w:r>
+        <w:t xml:space="preserve">Определите, используя конвейер команд </w:t>
+      </w:r>
+      <w:r>
+        <w:rPr>
+          <w:b/>
+          <w:lang w:val="en-US"/>
+        </w:rPr>
+        <w:t>who</w:t>
+      </w:r>
+      <w:r>
+        <w:t xml:space="preserve"> и </w:t>
+      </w:r>
+      <w:proofErr w:type="spellStart"/>
+      <w:r>
+        <w:rPr>
+          <w:b/>
+          <w:lang w:val="en-US"/>
+        </w:rPr>
+        <w:t>wc</w:t>
+      </w:r>
+      <w:proofErr w:type="spellEnd"/>
+      <w:r>
+        <w:t>, количество пользователей, подключенных к серверу в данный момент времени</w:t>
+      </w:r>
+      <w:r>
+        <w:t>.</w:t>
+      </w:r>
+    </w:p>
+    <w:p>
+      <w:r>
+        <w:pict>
+          <v:shape id="_x0000_i1334" type="#_x0000_t75" style="width:467.7pt;height:19.4pt">
+            <v:imagedata r:id="rId45" o:title="t17"/>
+          </v:shape>
+        </w:pict>
+      </w:r>
+    </w:p>
+    <w:p>
+      <w:pPr>
+        <w:pStyle w:val="2"/>
+        <w:numPr>
+          <w:ilvl w:val="0"/>
+          <w:numId w:val="7"/>
+        </w:numPr>
+        <w:ind w:left="284" w:hanging="284"/>
+        <w:rPr>
+          <w:lang w:val="en-US"/>
+        </w:rPr>
+      </w:pPr>
+    </w:p>
+    <w:p>
+      <w:pPr>
+        <w:pStyle w:val="a6"/>
+      </w:pPr>
+      <w:r>
+        <w:t>Получите информацию по оборуд</w:t>
+      </w:r>
+      <w:bookmarkStart w:id="2" w:name="_GoBack"/>
+      <w:bookmarkEnd w:id="2"/>
+      <w:r>
+        <w:t>ованию и операционной системе сервера.</w:t>
+      </w:r>
+      <w:r>
+        <w:t xml:space="preserve"> </w:t>
+      </w:r>
+      <w:r>
+        <w:t xml:space="preserve">Сведения о процессоре получите с помощью команд </w:t>
+      </w:r>
+      <w:r>
+        <w:rPr>
+          <w:b/>
+          <w:lang w:val="en-US"/>
+        </w:rPr>
+        <w:t>cat</w:t>
+      </w:r>
+      <w:r>
+        <w:rPr>
+          <w:b/>
+        </w:rPr>
+        <w:t xml:space="preserve"> </w:t>
+      </w:r>
+      <w:r>
+        <w:t>и</w:t>
+      </w:r>
+      <w:r>
+        <w:t xml:space="preserve"> </w:t>
+      </w:r>
+      <w:proofErr w:type="spellStart"/>
+      <w:r>
+        <w:t>lscpu</w:t>
+      </w:r>
+      <w:proofErr w:type="spellEnd"/>
+      <w:r>
+        <w:rPr>
+          <w:b/>
+        </w:rPr>
+        <w:t xml:space="preserve">, </w:t>
+      </w:r>
+      <w:r>
+        <w:t>сравните</w:t>
+      </w:r>
+      <w:r>
+        <w:t xml:space="preserve"> их результаты (модель и количество процессоров, число ядер, тактовая частота, размер кэш-памяти). Сведения о параметрах памяти можно получить командой </w:t>
+      </w:r>
+      <w:r>
+        <w:rPr>
+          <w:b/>
+          <w:lang w:val="en-US"/>
+        </w:rPr>
+        <w:t>cat</w:t>
+      </w:r>
+      <w:r>
+        <w:t xml:space="preserve">, об установленной ОС – командой </w:t>
+      </w:r>
+      <w:proofErr w:type="spellStart"/>
+      <w:r>
+        <w:rPr>
+          <w:b/>
+          <w:lang w:val="en-US"/>
+        </w:rPr>
+        <w:t>uname</w:t>
+      </w:r>
+      <w:proofErr w:type="spellEnd"/>
+      <w:r>
+        <w:t>.</w:t>
+      </w:r>
+    </w:p>
+    <w:p>
+      <w:pPr>
+        <w:pStyle w:val="2"/>
+        <w:numPr>
+          <w:ilvl w:val="0"/>
+          <w:numId w:val="7"/>
+        </w:numPr>
+        <w:ind w:left="284" w:hanging="284"/>
+        <w:rPr>
+          <w:lang w:val="en-US"/>
+        </w:rPr>
+      </w:pPr>
+      <w:proofErr w:type="spellStart"/>
+      <w:r>
+        <w:rPr>
+          <w:lang w:val="en-US"/>
+        </w:rPr>
+        <w:t>Sdadsdsasd</w:t>
+      </w:r>
+      <w:proofErr w:type="spellEnd"/>
+    </w:p>
+    <w:p>
+      <w:pPr>
+        <w:pStyle w:val="2"/>
+        <w:numPr>
+          <w:ilvl w:val="0"/>
+          <w:numId w:val="7"/>
+        </w:numPr>
+        <w:ind w:left="284" w:hanging="284"/>
+        <w:rPr>
+          <w:lang w:val="en-US"/>
+        </w:rPr>
+      </w:pPr>
+      <w:proofErr w:type="spellStart"/>
+      <w:r>
+        <w:rPr>
+          <w:lang w:val="en-US"/>
+        </w:rPr>
+        <w:t>Sdadsdsasd</w:t>
+      </w:r>
+      <w:proofErr w:type="spellEnd"/>
+    </w:p>
+    <w:p>
+      <w:pPr>
+        <w:pStyle w:val="2"/>
+        <w:numPr>
+          <w:ilvl w:val="0"/>
+          <w:numId w:val="7"/>
+        </w:numPr>
+        <w:ind w:left="284" w:hanging="284"/>
+        <w:rPr>
+          <w:lang w:val="en-US"/>
+        </w:rPr>
+      </w:pPr>
+      <w:proofErr w:type="spellStart"/>
+      <w:r>
+        <w:rPr>
+          <w:lang w:val="en-US"/>
+        </w:rPr>
+        <w:t>Sdadsdsasd</w:t>
+      </w:r>
+      <w:proofErr w:type="spellEnd"/>
+    </w:p>
+    <w:p>
+      <w:pPr>
+        <w:pStyle w:val="2"/>
+        <w:numPr>
+          <w:ilvl w:val="0"/>
+          <w:numId w:val="7"/>
+        </w:numPr>
+        <w:ind w:left="284" w:hanging="284"/>
+        <w:rPr>
+          <w:lang w:val="en-US"/>
+        </w:rPr>
+      </w:pPr>
+      <w:proofErr w:type="spellStart"/>
+      <w:r>
+        <w:rPr>
+          <w:lang w:val="en-US"/>
+        </w:rPr>
+        <w:t>Sdadsdsasd</w:t>
+      </w:r>
+      <w:proofErr w:type="spellEnd"/>
+    </w:p>
+    <w:p>
+      <w:pPr>
+        <w:rPr>
+          <w:lang w:val="en-US"/>
+        </w:rPr>
       </w:pPr>
     </w:p>
     <w:sectPr>
@@ -3032,7 +4198,7 @@
   <w:abstractNum w:abstractNumId="3" w15:restartNumberingAfterBreak="0">
     <w:nsid w:val="25E5690E"/>
     <w:multiLevelType w:val="hybridMultilevel"/>
-    <w:tmpl w:val="83B056F8"/>
+    <w:tmpl w:val="69D8E27C"/>
     <w:lvl w:ilvl="0" w:tplc="54C2ED8C">
       <w:start w:val="1"/>
       <w:numFmt w:val="decimal"/>
@@ -4078,7 +5244,6 @@
   <w:style w:type="character" w:default="1" w:styleId="a1">
     <w:name w:val="Default Paragraph Font"/>
     <w:uiPriority w:val="1"/>
-    <w:semiHidden/>
     <w:unhideWhenUsed/>
   </w:style>
   <w:style w:type="table" w:default="1" w:styleId="a2">
@@ -4207,15 +5372,15 @@
     <w:basedOn w:val="a0"/>
     <w:link w:val="12"/>
     <w:qFormat/>
-    <w:rsid w:val="00F7042D"/>
+    <w:rsid w:val="00E45CF8"/>
     <w:pPr>
       <w:spacing w:after="0" w:line="240" w:lineRule="auto"/>
       <w:jc w:val="center"/>
     </w:pPr>
     <w:rPr>
-      <w:rFonts w:ascii="Calibri" w:eastAsia="Calibri" w:hAnsi="Calibri" w:cs="Times New Roman"/>
+      <w:rFonts w:asciiTheme="majorHAnsi" w:eastAsia="Calibri" w:hAnsiTheme="majorHAnsi" w:cstheme="majorHAnsi"/>
       <w:smallCaps/>
-      <w:sz w:val="32"/>
+      <w:sz w:val="28"/>
       <w:szCs w:val="28"/>
     </w:rPr>
   </w:style>
@@ -4223,11 +5388,11 @@
     <w:name w:val="Стиль1 Знак"/>
     <w:basedOn w:val="a1"/>
     <w:link w:val="11"/>
-    <w:rsid w:val="00F7042D"/>
+    <w:rsid w:val="00E45CF8"/>
     <w:rPr>
-      <w:rFonts w:ascii="Calibri" w:eastAsia="Calibri" w:hAnsi="Calibri" w:cs="Times New Roman"/>
+      <w:rFonts w:asciiTheme="majorHAnsi" w:eastAsia="Calibri" w:hAnsiTheme="majorHAnsi" w:cstheme="majorHAnsi"/>
       <w:smallCaps/>
-      <w:sz w:val="32"/>
+      <w:sz w:val="28"/>
       <w:szCs w:val="28"/>
     </w:rPr>
   </w:style>
@@ -4549,31 +5714,31 @@
 <w:fonts xmlns:mc="http://schemas.openxmlformats.org/markup-compatibility/2006" xmlns:r="http://schemas.openxmlformats.org/officeDocument/2006/relationships" xmlns:w="http://schemas.openxmlformats.org/wordprocessingml/2006/main" xmlns:w14="http://schemas.microsoft.com/office/word/2010/wordml" xmlns:w15="http://schemas.microsoft.com/office/word/2012/wordml" xmlns:w16se="http://schemas.microsoft.com/office/word/2015/wordml/symex" mc:Ignorable="w14 w15 w16se">
   <w:font w:name="Times New Roman">
     <w:panose1 w:val="02020603050405020304"/>
-    <w:charset w:val="00"/>
+    <w:charset w:val="CC"/>
     <w:family w:val="roman"/>
     <w:pitch w:val="variable"/>
-    <w:sig w:usb0="E0002AFF" w:usb1="C0007843" w:usb2="00000009" w:usb3="00000000" w:csb0="000001FF" w:csb1="00000000"/>
+    <w:sig w:usb0="E0002EFF" w:usb1="C000785B" w:usb2="00000009" w:usb3="00000000" w:csb0="000001FF" w:csb1="00000000"/>
   </w:font>
   <w:font w:name="Calibri">
     <w:panose1 w:val="020F0502020204030204"/>
-    <w:charset w:val="00"/>
+    <w:charset w:val="CC"/>
     <w:family w:val="swiss"/>
     <w:pitch w:val="variable"/>
-    <w:sig w:usb0="E00002FF" w:usb1="4000ACFF" w:usb2="00000001" w:usb3="00000000" w:csb0="0000019F" w:csb1="00000000"/>
+    <w:sig w:usb0="E4002EFF" w:usb1="C200247B" w:usb2="00000009" w:usb3="00000000" w:csb0="000001FF" w:csb1="00000000"/>
   </w:font>
   <w:font w:name="Calibri Light">
     <w:panose1 w:val="020F0302020204030204"/>
-    <w:charset w:val="00"/>
+    <w:charset w:val="CC"/>
     <w:family w:val="swiss"/>
     <w:pitch w:val="variable"/>
-    <w:sig w:usb0="A00002EF" w:usb1="4000207B" w:usb2="00000000" w:usb3="00000000" w:csb0="0000009F" w:csb1="00000000"/>
+    <w:sig w:usb0="E4002EFF" w:usb1="C200247B" w:usb2="00000009" w:usb3="00000000" w:csb0="000001FF" w:csb1="00000000"/>
   </w:font>
   <w:font w:name="Arial">
     <w:panose1 w:val="020B0604020202020204"/>
-    <w:charset w:val="00"/>
+    <w:charset w:val="CC"/>
     <w:family w:val="swiss"/>
     <w:pitch w:val="variable"/>
-    <w:sig w:usb0="E0002AFF" w:usb1="C0007843" w:usb2="00000009" w:usb3="00000000" w:csb0="000001FF" w:csb1="00000000"/>
+    <w:sig w:usb0="E0002EFF" w:usb1="C000785B" w:usb2="00000009" w:usb3="00000000" w:csb0="000001FF" w:csb1="00000000"/>
   </w:font>
 </w:fonts>
 </file>
@@ -4595,7 +5760,9 @@
     <w:rsidRoot w:val="00132AFE"/>
     <w:rsid w:val="00132AFE"/>
     <w:rsid w:val="003D3D39"/>
+    <w:rsid w:val="005F376B"/>
     <w:rsid w:val="006846F6"/>
+    <w:rsid w:val="008D1838"/>
     <w:rsid w:val="00C37B26"/>
   </w:rsids>
   <m:mathPr>

</xml_diff>